<commit_message>
Update: Add English pages and modify existing pages with style updates
</commit_message>
<xml_diff>
--- a/普蓝OPC-AI训练营宣传渠道矩阵与微信群命名规范.docx
+++ b/普蓝OPC-AI训练营宣传渠道矩阵与微信群命名规范.docx
@@ -1067,6 +1067,14 @@
               </w:rPr>
               <w:t>短图文/海报：训练营日常、项目成果、学员故事、FDE 技能点</w:t>
             </w:r>
+            <w:r>
+              <w:rPr>
+                <w:rFonts w:hint="eastAsia"/>
+                <w:sz w:val="19"/>
+                <w:lang w:eastAsia="zh-CN"/>
+              </w:rPr>
+              <w:t>；科普类/热点类/技术性；</w:t>
+            </w:r>
           </w:p>
         </w:tc>
         <w:tc>
@@ -1106,8 +1114,6 @@
               </w:rPr>
               <w:t>微信群：兴趣/招募群</w:t>
             </w:r>
-            <w:bookmarkStart w:id="0" w:name="_GoBack"/>
-            <w:bookmarkEnd w:id="0"/>
           </w:p>
         </w:tc>
         <w:tc>
@@ -2365,12 +2371,14 @@
             <w:pPr>
               <w:spacing w:after="40"/>
             </w:pPr>
+            <w:bookmarkStart w:id="0" w:name="_GoBack"/>
             <w:r>
               <w:rPr>
                 <w:sz w:val="19"/>
               </w:rPr>
               <w:t>普蓝OPC-AI训练营｜S{期数}{课程名}</w:t>
             </w:r>
+            <w:bookmarkEnd w:id="0"/>
           </w:p>
         </w:tc>
         <w:tc>
@@ -2890,12 +2898,39 @@
           <w:p>
             <w:pPr>
               <w:spacing w:after="40"/>
+              <w:rPr>
+                <w:rFonts w:hint="eastAsia"/>
+                <w:lang w:eastAsia="zh-CN"/>
+              </w:rPr>
             </w:pPr>
             <w:r>
               <w:rPr>
                 <w:sz w:val="19"/>
               </w:rPr>
               <w:t>普蓝OPC-AI训练营｜兴趣社群</w:t>
+            </w:r>
+            <w:r>
+              <w:rPr>
+                <w:rFonts w:hint="eastAsia"/>
+                <w:sz w:val="19"/>
+                <w:lang w:eastAsia="zh-CN"/>
+              </w:rPr>
+              <w:t xml:space="preserve"> </w:t>
+            </w:r>
+            <w:r>
+              <w:rPr>
+                <w:sz w:val="19"/>
+                <w:lang w:eastAsia="zh-CN"/>
+              </w:rPr>
+              <w:t>1</w:t>
+            </w:r>
+            <w:r>
+              <w:rPr>
+                <w:rFonts w:hint="eastAsia"/>
+                <w:sz w:val="19"/>
+                <w:lang w:eastAsia="zh-CN"/>
+              </w:rPr>
+              <w:t>群</w:t>
             </w:r>
           </w:p>
         </w:tc>
@@ -2946,12 +2981,45 @@
           <w:p>
             <w:pPr>
               <w:spacing w:after="40"/>
-            </w:pPr>
-            <w:r>
-              <w:rPr>
-                <w:sz w:val="19"/>
-              </w:rPr>
-              <w:t>普蓝OPC-AI训练营｜S02项目制｜归档</w:t>
+              <w:rPr>
+                <w:rFonts w:hint="eastAsia"/>
+                <w:lang w:eastAsia="zh-CN"/>
+              </w:rPr>
+            </w:pPr>
+            <w:r>
+              <w:rPr>
+                <w:sz w:val="19"/>
+              </w:rPr>
+              <w:t>普蓝OPC-AI训练营｜</w:t>
+            </w:r>
+            <w:r>
+              <w:rPr>
+                <w:sz w:val="19"/>
+              </w:rPr>
+              <w:t>兴趣社群</w:t>
+            </w:r>
+            <w:r>
+              <w:rPr>
+                <w:rFonts w:hint="eastAsia"/>
+                <w:sz w:val="19"/>
+                <w:lang w:eastAsia="zh-CN"/>
+              </w:rPr>
+              <w:t xml:space="preserve"> </w:t>
+            </w:r>
+            <w:r>
+              <w:rPr>
+                <w:sz w:val="19"/>
+                <w:lang w:eastAsia="zh-CN"/>
+              </w:rPr>
+              <w:t>2</w:t>
+            </w:r>
+            <w:r>
+              <w:rPr>
+                <w:rFonts w:hint="eastAsia"/>
+                <w:sz w:val="19"/>
+                <w:lang w:eastAsia="zh-CN"/>
+              </w:rPr>
+              <w:t>群</w:t>
             </w:r>
           </w:p>
         </w:tc>
@@ -3022,7 +3090,15 @@
                 <w:sz w:val="19"/>
               </w:rPr>
               <w:lastRenderedPageBreak/>
-              <w:t>S01技能培训｜归档</w:t>
+              <w:t>S01技能培训｜</w:t>
+            </w:r>
+            <w:r>
+              <w:rPr>
+                <w:rFonts w:hint="eastAsia"/>
+                <w:sz w:val="19"/>
+                <w:lang w:eastAsia="zh-CN"/>
+              </w:rPr>
+              <w:t>自由命题</w:t>
             </w:r>
           </w:p>
         </w:tc>
@@ -3808,19 +3884,7 @@
     </w:p>
     <w:p>
       <w:r>
-        <w:t>建议为普蓝</w:t>
-      </w:r>
-      <w:r>
-        <w:t>OPC-AI</w:t>
-      </w:r>
-      <w:r>
-        <w:t>训练营建立一个统一的云端工作空间，把宣传、课程、项目、运营和成果资料沉淀成可检索、可引用、可权限管理的知识库。团队成员和各自负责的</w:t>
-      </w:r>
-      <w:r>
-        <w:t xml:space="preserve"> AI Agent </w:t>
-      </w:r>
-      <w:r>
-        <w:t>都接入同一个知识底座，从库中提取经过确认的信息，辅助完成公众号、小红书、报名答疑、项目介绍、复盘报告、课程运营等内容生产。</w:t>
+        <w:t>建议为普蓝OPC-AI训练营建立一个统一的云端工作空间，把宣传、课程、项目、运营和成果资料沉淀成可检索、可引用、可权限管理的知识库。团队成员和各自负责的 AI Agent 都接入同一个知识底座，从库中提取经过确认的信息，辅助完成公众号、小红书、报名答疑、项目介绍、复盘报告、课程运营等内容生产。</w:t>
       </w:r>
     </w:p>
     <w:p>
@@ -3838,25 +3902,7 @@
         <w:spacing w:after="80"/>
       </w:pPr>
       <w:r>
-        <w:t>使用方式：每个角色可以带着自己的</w:t>
-      </w:r>
-      <w:r>
-        <w:t xml:space="preserve"> AI Agent </w:t>
-      </w:r>
-      <w:r>
-        <w:t>接入知识库，例如宣传同学生成推文草稿，课程运营生成通知和</w:t>
-      </w:r>
-      <w:r>
-        <w:t xml:space="preserve"> FAQ</w:t>
-      </w:r>
-      <w:r>
-        <w:t>，项目负责人生成项目简介，导师</w:t>
-      </w:r>
-      <w:r>
-        <w:t>/</w:t>
-      </w:r>
-      <w:r>
-        <w:t>助教生成复盘材料。</w:t>
+        <w:t>使用方式：每个角色可以带着自己的 AI Agent 接入知识库，例如宣传同学生成推文草稿，课程运营生成通知和 FAQ，项目负责人生成项目简介，导师/助教生成复盘材料。</w:t>
       </w:r>
     </w:p>
     <w:p>
@@ -3969,15 +4015,7 @@
                 <w:color w:val="1F4D78"/>
                 <w:sz w:val="19"/>
               </w:rPr>
-              <w:t xml:space="preserve">AI Agent </w:t>
-            </w:r>
-            <w:r>
-              <w:rPr>
-                <w:b/>
-                <w:color w:val="1F4D78"/>
-                <w:sz w:val="19"/>
-              </w:rPr>
-              <w:t>使用方式</w:t>
+              <w:t>AI Agent 使用方式</w:t>
             </w:r>
           </w:p>
         </w:tc>
@@ -3999,19 +4037,7 @@
               <w:rPr>
                 <w:sz w:val="19"/>
               </w:rPr>
-              <w:t>官方认定信息</w:t>
-            </w:r>
-            <w:r>
-              <w:rPr>
-                <w:sz w:val="19"/>
-              </w:rPr>
-              <w:t xml:space="preserve"> / </w:t>
-            </w:r>
-            <w:r>
-              <w:rPr>
-                <w:sz w:val="19"/>
-              </w:rPr>
-              <w:t>资料</w:t>
+              <w:t>官方认定信息 / 资料</w:t>
             </w:r>
           </w:p>
         </w:tc>
@@ -4062,19 +4088,7 @@
               <w:rPr>
                 <w:sz w:val="19"/>
               </w:rPr>
-              <w:t>作为生成宣传文案、群公告、报名</w:t>
-            </w:r>
-            <w:r>
-              <w:rPr>
-                <w:sz w:val="19"/>
-              </w:rPr>
-              <w:t xml:space="preserve"> FAQ</w:t>
-            </w:r>
-            <w:r>
-              <w:rPr>
-                <w:sz w:val="19"/>
-              </w:rPr>
-              <w:t>、项目介绍的最高优先级知识源</w:t>
+              <w:t>作为生成宣传文案、群公告、报名 FAQ、项目介绍的最高优先级知识源</w:t>
             </w:r>
           </w:p>
         </w:tc>
@@ -4113,26 +4127,14 @@
               <w:rPr>
                 <w:sz w:val="19"/>
               </w:rPr>
-              <w:t>报名表数据、群公告历史、说明会纪要、课程通知、作业要求、学员分组、</w:t>
-            </w:r>
-            <w:r>
-              <w:rPr>
-                <w:sz w:val="19"/>
-              </w:rPr>
-              <w:t xml:space="preserve">Demo </w:t>
+              <w:t xml:space="preserve">报名表数据、群公告历史、说明会纪要、课程通知、作业要求、学员分组、Demo </w:t>
             </w:r>
             <w:r>
               <w:rPr>
                 <w:sz w:val="19"/>
               </w:rPr>
               <w:lastRenderedPageBreak/>
-              <w:t xml:space="preserve">Day </w:t>
-            </w:r>
-            <w:r>
-              <w:rPr>
-                <w:sz w:val="19"/>
-              </w:rPr>
-              <w:t>安排</w:t>
+              <w:t>Day 安排</w:t>
             </w:r>
           </w:p>
         </w:tc>
@@ -4206,37 +4208,7 @@
               <w:rPr>
                 <w:sz w:val="19"/>
               </w:rPr>
-              <w:t xml:space="preserve">S01/S02/S03 </w:t>
-            </w:r>
-            <w:r>
-              <w:rPr>
-                <w:sz w:val="19"/>
-              </w:rPr>
-              <w:t>项目简介、</w:t>
-            </w:r>
-            <w:r>
-              <w:rPr>
-                <w:sz w:val="19"/>
-              </w:rPr>
-              <w:t xml:space="preserve">Demo </w:t>
-            </w:r>
-            <w:r>
-              <w:rPr>
-                <w:sz w:val="19"/>
-              </w:rPr>
-              <w:t>视频、</w:t>
-            </w:r>
-            <w:r>
-              <w:rPr>
-                <w:sz w:val="19"/>
-              </w:rPr>
-              <w:t xml:space="preserve">GitHub </w:t>
-            </w:r>
-            <w:r>
-              <w:rPr>
-                <w:sz w:val="19"/>
-              </w:rPr>
-              <w:t>链接、导师点评、企业反馈、项目进度与孵化状态</w:t>
+              <w:t>S01/S02/S03 项目简介、Demo 视频、GitHub 链接、导师点评、企业反馈、项目进度与孵化状态</w:t>
             </w:r>
           </w:p>
         </w:tc>
@@ -4270,19 +4242,7 @@
               <w:rPr>
                 <w:sz w:val="19"/>
               </w:rPr>
-              <w:t>用于生成项目库页面、小红书成果图文、公众号成果盘点、投资</w:t>
-            </w:r>
-            <w:r>
-              <w:rPr>
-                <w:sz w:val="19"/>
-              </w:rPr>
-              <w:t>/</w:t>
-            </w:r>
-            <w:r>
-              <w:rPr>
-                <w:sz w:val="19"/>
-              </w:rPr>
-              <w:t>企业对接材料</w:t>
+              <w:t>用于生成项目库页面、小红书成果图文、公众号成果盘点、投资/企业对接材料</w:t>
             </w:r>
           </w:p>
         </w:tc>
@@ -4304,19 +4264,7 @@
               <w:rPr>
                 <w:sz w:val="19"/>
               </w:rPr>
-              <w:t>补充信息</w:t>
-            </w:r>
-            <w:r>
-              <w:rPr>
-                <w:sz w:val="19"/>
-              </w:rPr>
-              <w:t xml:space="preserve"> / </w:t>
-            </w:r>
-            <w:r>
-              <w:rPr>
-                <w:sz w:val="19"/>
-              </w:rPr>
-              <w:t>临时资料</w:t>
+              <w:t>补充信息 / 临时资料</w:t>
             </w:r>
           </w:p>
         </w:tc>
@@ -4392,61 +4340,7 @@
         <w:spacing w:after="80"/>
       </w:pPr>
       <w:r>
-        <w:t>先建立一个云盘</w:t>
-      </w:r>
-      <w:r>
-        <w:t>/</w:t>
-      </w:r>
-      <w:r>
-        <w:t>在线文档空间，按</w:t>
-      </w:r>
-      <w:r>
-        <w:t>“00_</w:t>
-      </w:r>
-      <w:r>
-        <w:t>官方口径、</w:t>
-      </w:r>
-      <w:r>
-        <w:t>01_</w:t>
-      </w:r>
-      <w:r>
-        <w:t>宣传素材、</w:t>
-      </w:r>
-      <w:r>
-        <w:t>02_</w:t>
-      </w:r>
-      <w:r>
-        <w:t>课程运营、</w:t>
-      </w:r>
-      <w:r>
-        <w:t>03_</w:t>
-      </w:r>
-      <w:r>
-        <w:t>项目库、</w:t>
-      </w:r>
-      <w:r>
-        <w:t>04_</w:t>
-      </w:r>
-      <w:r>
-        <w:t>报名数据、</w:t>
-      </w:r>
-      <w:r>
-        <w:t>05_</w:t>
-      </w:r>
-      <w:r>
-        <w:t>复盘归档、</w:t>
-      </w:r>
-      <w:r>
-        <w:t>99_</w:t>
-      </w:r>
-      <w:r>
-        <w:t>临时资料</w:t>
-      </w:r>
-      <w:r>
-        <w:t>”</w:t>
-      </w:r>
-      <w:r>
-        <w:t>分区。</w:t>
+        <w:t>先建立一个云盘/在线文档空间，按“00_官方口径、01_宣传素材、02_课程运营、03_项目库、04_报名数据、05_复盘归档、99_临时资料”分区。</w:t>
       </w:r>
     </w:p>
     <w:p>
@@ -4455,10 +4349,7 @@
         <w:spacing w:after="80"/>
       </w:pPr>
       <w:r>
-        <w:t>每份资料增加元数据：所属期数、负责</w:t>
-      </w:r>
-      <w:r>
-        <w:t>人、最后更新时间、是否可对外、引用优先级。</w:t>
+        <w:t>每份资料增加元数据：所属期数、负责人、最后更新时间、是否可对外、引用优先级。</w:t>
       </w:r>
     </w:p>
     <w:p>
@@ -4476,19 +4367,7 @@
         <w:spacing w:after="80"/>
       </w:pPr>
       <w:r>
-        <w:t>后续再升级为向量数据库或</w:t>
-      </w:r>
-      <w:r>
-        <w:t xml:space="preserve"> RAG </w:t>
-      </w:r>
-      <w:r>
-        <w:t>知识库，让团队成员的</w:t>
-      </w:r>
-      <w:r>
-        <w:t xml:space="preserve"> AI Agent </w:t>
-      </w:r>
-      <w:r>
-        <w:t>可以按权限检索和引用。</w:t>
+        <w:t>后续再升级为向量数据库或 RAG 知识库，让团队成员的 AI Agent 可以按权限检索和引用。</w:t>
       </w:r>
     </w:p>
     <w:sectPr>
@@ -16475,7 +16354,7 @@
 </file>
 
 <file path=customXml/itemProps1.xml><?xml version="1.0" encoding="utf-8"?>
-<ds:datastoreItem xmlns:ds="http://schemas.openxmlformats.org/officeDocument/2006/customXml" ds:itemID="{B9A743D9-F761-4C5A-9480-E5A174548559}">
+<ds:datastoreItem xmlns:ds="http://schemas.openxmlformats.org/officeDocument/2006/customXml" ds:itemID="{84DCF4E5-F659-4FBD-861B-E1C72DF0C4DE}">
   <ds:schemaRefs>
     <ds:schemaRef ds:uri="http://schemas.openxmlformats.org/officeDocument/2006/bibliography"/>
   </ds:schemaRefs>

</xml_diff>